<commit_message>
docs: correct resume regression count
</commit_message>
<xml_diff>
--- a/数字IC前端项目经历.docx
+++ b/数字IC前端项目经历.docx
@@ -210,7 +210,7 @@
           <w:b w:val="0"/>
           <w:sz w:val="20"/>
         </w:rPr>
-        <w:t>基于 Icarus Verilog 完成 33 个 SystemVerilog Testbench 回归，全部 PASS；apb_subsystem 与 soc_top 静态 elaboration 通过。</w:t>
+        <w:t>基于 Icarus Verilog 完成 36 个 SystemVerilog Testbench 回归，全部 PASS；apb_subsystem 与 soc_top 静态 elaboration 通过。</w:t>
       </w:r>
     </w:p>
     <w:p>
@@ -269,7 +269,7 @@
           <w:b w:val="0"/>
           <w:sz w:val="19"/>
         </w:rPr>
-        <w:t>搭建单元至 SoC 的 SystemVerilog 自检回归，覆盖协议时序、异常状态、FIFO 满空/回绕/独立复位及端到端数据搬运；33 个 Testbench 全部 PASS。</w:t>
+        <w:t>搭建单元至 SoC 的 SystemVerilog 自检回归，覆盖协议时序、异常状态、FIFO 满空/回绕/独立复位及端到端数据搬运；36 个 Testbench 全部 PASS。</w:t>
       </w:r>
     </w:p>
     <w:sectPr>

</xml_diff>